<commit_message>
Fix experience and education bug
</commit_message>
<xml_diff>
--- a/Phong Nguyen Cover letter.docx
+++ b/Phong Nguyen Cover letter.docx
@@ -979,7 +979,7 @@
         <w:rPr>
           <w:rFonts w:hint="default" w:ascii="Times New Roman" w:hAnsi="Times New Roman" w:eastAsia="sans-serif" w:cs="Times New Roman"/>
         </w:rPr>
-        <w:t xml:space="preserve">Dear Hiring Team, </w:t>
+        <w:t>Dear Hiring Team,</w:t>
       </w:r>
     </w:p>
     <w:p>
@@ -998,20 +998,7 @@
         <w:rPr>
           <w:rFonts w:hint="default" w:ascii="Times New Roman" w:hAnsi="Times New Roman" w:eastAsia="sans-serif" w:cs="Times New Roman"/>
         </w:rPr>
-        <w:t>I am writing to express my strong interest in the Web (CMS) Developer position at Craft&amp;Crew. As a software developer and recent Computer Science graduate from the University of British Columbia Okanagan, I bring a robust foundation in full-stack web architectures combined with direct experience managing independent technical contracts. I am currently located in Canada and fully prepared to meet the remote work expectations and annual in-person event requirements outlined by your tea</w:t>
-      </w:r>
-      <w:r>
-        <w:rPr>
-          <w:rFonts w:hint="default" w:eastAsia="sans-serif" w:cs="Times New Roman"/>
-          <w:lang w:val="en-US"/>
-        </w:rPr>
-        <w:t>m</w:t>
-      </w:r>
-      <w:r>
-        <w:rPr>
-          <w:rFonts w:hint="default" w:ascii="Times New Roman" w:hAnsi="Times New Roman" w:eastAsia="sans-serif" w:cs="Times New Roman"/>
-        </w:rPr>
-        <w:t xml:space="preserve">. </w:t>
+        <w:t xml:space="preserve">I am writing to express my enthusiastic interest in the Web Developer I position within LawDepot’s UX Optimization team. As a recent Computer Science graduate from the University of British Columbia Okanagan with hands-on full-stack development experience, I am eager to contribute to a platform that modernizes legal solutions for over 25 million annual users. I am fully authorized to work in Canada and am highly interested in your hybrid or remote work arrangements. </w:t>
       </w:r>
     </w:p>
     <w:p>
@@ -1030,7 +1017,7 @@
         <w:rPr>
           <w:rFonts w:hint="default" w:ascii="Times New Roman" w:hAnsi="Times New Roman" w:eastAsia="sans-serif" w:cs="Times New Roman"/>
         </w:rPr>
-        <w:t>Craft&amp;Crew’s dedication to technical excellence, web accessibility, and robust digital experiences strongly aligns with my own development philosophy. In my current role as a Freelance Web Developer, I partner directly with independent stakeholders to translate complex design layouts and stakeholder goals into functional, responsive web components. This hands-on experience has reinforced my commitment to writing clean, maintainable code and optimizing system performance—skills that directly transfer to building and supporting large-scale websites using Drupal, WordPress, and Craft CMS.</w:t>
+        <w:t xml:space="preserve">LawDepot’s mission to empower individuals through fast, easy-to-use digital legal products strongly resonates with my background in human-centric software design. In my freelance development work and software projects, I specialize in translating complex system constraints and user requirements into clean, highly structured code. My experience managing content hierarchies, combined with an educational focus on logic-driven systems, positions me to seamlessly support your product migrations, template implementations, and ongoing system improvements. </w:t>
       </w:r>
     </w:p>
     <w:p>
@@ -1049,51 +1036,7 @@
         <w:rPr>
           <w:rFonts w:hint="default" w:ascii="Times New Roman" w:hAnsi="Times New Roman" w:eastAsia="sans-serif" w:cs="Times New Roman"/>
         </w:rPr>
-        <w:t>I am well-prepared to contribute to the core needs at Craft&amp;Crew:</w:t>
-      </w:r>
-    </w:p>
-    <w:p>
-      <w:pPr>
-        <w:keepNext w:val="0"/>
-        <w:keepLines w:val="0"/>
-        <w:widowControl/>
-        <w:numPr>
-          <w:numId w:val="0"/>
-        </w:numPr>
-        <w:suppressLineNumbers w:val="0"/>
-        <w:spacing w:before="0" w:beforeAutospacing="0" w:after="0" w:afterAutospacing="1" w:line="17" w:lineRule="atLeast"/>
-        <w:ind w:left="1080" w:leftChars="0"/>
-        <w:rPr>
-          <w:rFonts w:hint="default" w:ascii="Times New Roman" w:hAnsi="Times New Roman" w:eastAsia="sans-serif" w:cs="Times New Roman"/>
-        </w:rPr>
-      </w:pPr>
-    </w:p>
-    <w:p>
-      <w:pPr>
-        <w:pStyle w:val="7"/>
-        <w:keepNext w:val="0"/>
-        <w:keepLines w:val="0"/>
-        <w:widowControl/>
-        <w:suppressLineNumbers w:val="0"/>
-        <w:spacing w:before="0" w:beforeAutospacing="0" w:line="17" w:lineRule="atLeast"/>
-        <w:ind w:left="720"/>
-        <w:rPr>
-          <w:rFonts w:hint="default" w:ascii="Times New Roman" w:hAnsi="Times New Roman" w:eastAsia="sans-serif" w:cs="Times New Roman"/>
-        </w:rPr>
-      </w:pPr>
-      <w:r>
-        <w:rPr>
-          <w:rFonts w:hint="default" w:ascii="Times New Roman" w:hAnsi="Times New Roman" w:eastAsia="sans-serif" w:cs="Times New Roman"/>
-          <w:b/>
-          <w:bCs/>
-        </w:rPr>
-        <w:t>Technical Adaptability &amp; Modern Tooling:</w:t>
-      </w:r>
-      <w:r>
-        <w:rPr>
-          <w:rFonts w:hint="default" w:ascii="Times New Roman" w:hAnsi="Times New Roman" w:eastAsia="sans-serif" w:cs="Times New Roman"/>
-        </w:rPr>
-        <w:t xml:space="preserve"> I bring a deep understanding of languages and frameworks including PHP, TypeScript, React, Next.js, and Prisma. I enforce high engineering standards by utilizing containerization with Docker and automated testing within CI/CD pipelines to guarantee secure, scalable deployments. My background in PHP ensures I can rapidly master and optimize your custom modules, themes, and integrations. </w:t>
+        <w:t>I am well-equipped to drive results across LawDepot's key responsibilities:</w:t>
       </w:r>
     </w:p>
     <w:p>
@@ -1115,13 +1058,13 @@
           <w:b/>
           <w:bCs/>
         </w:rPr>
-        <w:t>Proactive Problem Solving &amp; Content Support:</w:t>
+        <w:t>Logical Thinking &amp; Template Architecture:</w:t>
       </w:r>
       <w:r>
         <w:rPr>
           <w:rFonts w:hint="default" w:ascii="Times New Roman" w:hAnsi="Times New Roman" w:eastAsia="sans-serif" w:cs="Times New Roman"/>
         </w:rPr>
-        <w:t xml:space="preserve"> My specialization in complex decision-making algorithms and computer vision highlights my ability to tackle intricate technical logic head-on. Additionally, I am eager to jump in wherever needed, applying my analytical mindset to client troubleshooting, performance optimization, or general content support.</w:t>
+        <w:t xml:space="preserve"> My technical background has trained me to break down complex data into structured reasoning systems. I am highly comfortable building and refining interactive workflows, ensuring that conditional questionnaire logic and document templates guide customers smoothly through their experience.</w:t>
       </w:r>
     </w:p>
     <w:p>
@@ -1143,13 +1086,13 @@
           <w:b/>
           <w:bCs/>
         </w:rPr>
-        <w:t>Client Communication &amp; Process Improvement:</w:t>
+        <w:t>CMS Adaptability &amp; Code Maintainability:</w:t>
       </w:r>
       <w:r>
         <w:rPr>
           <w:rFonts w:hint="default" w:ascii="Times New Roman" w:hAnsi="Times New Roman" w:eastAsia="sans-serif" w:cs="Times New Roman"/>
         </w:rPr>
-        <w:t xml:space="preserve"> Through my professional contract work and my experience delivering exceptional service in high-volume environments, I have developed excellent interpersonal skills. I understand the value of explaining complex technical concepts clearly to stakeholders, conducting rigorous code reviews, and maintaining meticulous time tracking to keep projects on schedule and within resource constraints. </w:t>
+        <w:t xml:space="preserve"> I possess a strong foundation in modern web technologies—including TypeScript, React, Next.js, and PHP—allowing me to rapidly master, utilize, and troubleshoot your internal CMS and tooling platforms. I maintain a rigorous focus on code reviews, identifying patterns to reduce duplication, and refactoring solutions for long-term maintainability. </w:t>
       </w:r>
     </w:p>
     <w:p>
@@ -1160,6 +1103,7 @@
         <w:widowControl/>
         <w:suppressLineNumbers w:val="0"/>
         <w:spacing w:before="0" w:beforeAutospacing="0" w:line="17" w:lineRule="atLeast"/>
+        <w:ind w:left="720"/>
         <w:rPr>
           <w:rFonts w:hint="default" w:ascii="Times New Roman" w:hAnsi="Times New Roman" w:eastAsia="sans-serif" w:cs="Times New Roman"/>
         </w:rPr>
@@ -1167,8 +1111,16 @@
       <w:r>
         <w:rPr>
           <w:rFonts w:hint="default" w:ascii="Times New Roman" w:hAnsi="Times New Roman" w:eastAsia="sans-serif" w:cs="Times New Roman"/>
-        </w:rPr>
-        <w:t>I understand that while you are not actively hiring today, you are continuously looking for talented individuals to join your pipeline for future growth. I would welcome the opportunity to connect and discuss how my technical skill set and client-focused mindset can support Craft&amp;Crew as your team scales.</w:t>
+          <w:b/>
+          <w:bCs/>
+        </w:rPr>
+        <w:t>AI-Driven Efficiency &amp; Continuous Learning:</w:t>
+      </w:r>
+      <w:r>
+        <w:rPr>
+          <w:rFonts w:hint="default" w:ascii="Times New Roman" w:hAnsi="Times New Roman" w:eastAsia="sans-serif" w:cs="Times New Roman"/>
+        </w:rPr>
+        <w:t xml:space="preserve"> I am a self-driven developer who actively uses AI tools to accelerate development workflows, debug intricate technical bottlenecks, and optimize code quality while maintaining strong independent judgment. </w:t>
       </w:r>
     </w:p>
     <w:p>
@@ -1179,26 +1131,65 @@
         <w:widowControl/>
         <w:suppressLineNumbers w:val="0"/>
         <w:spacing w:before="0" w:beforeAutospacing="0" w:line="17" w:lineRule="atLeast"/>
-        <w:rPr>
-          <w:rFonts w:hint="default" w:ascii="Times New Roman" w:hAnsi="Times New Roman" w:eastAsia="sans-serif" w:cs="Times New Roman"/>
-          <w:lang w:val="en-US"/>
+        <w:ind w:left="720"/>
+        <w:rPr>
+          <w:rFonts w:hint="default" w:ascii="Times New Roman" w:hAnsi="Times New Roman" w:eastAsia="sans-serif" w:cs="Times New Roman"/>
         </w:rPr>
       </w:pPr>
       <w:r>
         <w:rPr>
           <w:rFonts w:hint="default" w:ascii="Times New Roman" w:hAnsi="Times New Roman" w:eastAsia="sans-serif" w:cs="Times New Roman"/>
-        </w:rPr>
-        <w:t>Thank you for your time and consideratio</w:t>
+          <w:b/>
+          <w:bCs/>
+        </w:rPr>
+        <w:t>Cross-Functional Collaboration:</w:t>
       </w:r>
       <w:r>
         <w:rPr>
-          <w:rFonts w:hint="default" w:eastAsia="sans-serif" w:cs="Times New Roman"/>
-          <w:lang w:val="en-US"/>
-        </w:rPr>
-        <w:t>n.</w:t>
+          <w:rFonts w:hint="default" w:ascii="Times New Roman" w:hAnsi="Times New Roman" w:eastAsia="sans-serif" w:cs="Times New Roman"/>
+        </w:rPr>
+        <w:t xml:space="preserve"> Having collaborated tightly across multi-disciplinary teams and direct business stakeholders, I understand the value of executing project deliverables in tandem with Legal, Design, and QA departments to ensure products are both user-friendly and highly accurate. </w:t>
       </w:r>
       <w:bookmarkStart w:id="0" w:name="_GoBack"/>
       <w:bookmarkEnd w:id="0"/>
+    </w:p>
+    <w:p>
+      <w:pPr>
+        <w:pStyle w:val="7"/>
+        <w:keepNext w:val="0"/>
+        <w:keepLines w:val="0"/>
+        <w:widowControl/>
+        <w:suppressLineNumbers w:val="0"/>
+        <w:spacing w:before="0" w:beforeAutospacing="0" w:line="17" w:lineRule="atLeast"/>
+        <w:rPr>
+          <w:rFonts w:hint="default" w:ascii="Times New Roman" w:hAnsi="Times New Roman" w:eastAsia="sans-serif" w:cs="Times New Roman"/>
+        </w:rPr>
+      </w:pPr>
+      <w:r>
+        <w:rPr>
+          <w:rFonts w:hint="default" w:ascii="Times New Roman" w:hAnsi="Times New Roman" w:eastAsia="sans-serif" w:cs="Times New Roman"/>
+        </w:rPr>
+        <w:t xml:space="preserve">I am excited about the opportunity to join a fast-growing, collaborative organization that values professional excellence, continuous learning, and a great work-life balance. Thank you for your time, consideration, and review of my attached resume. I look forward to the possibility of discussing how my technical skills and attention to detail can bring value to the UX Optimization team. </w:t>
+      </w:r>
+    </w:p>
+    <w:p>
+      <w:pPr>
+        <w:pStyle w:val="7"/>
+        <w:keepNext w:val="0"/>
+        <w:keepLines w:val="0"/>
+        <w:widowControl/>
+        <w:suppressLineNumbers w:val="0"/>
+        <w:spacing w:before="0" w:beforeAutospacing="0" w:line="17" w:lineRule="atLeast"/>
+        <w:rPr>
+          <w:rFonts w:hint="default" w:ascii="Times New Roman" w:hAnsi="Times New Roman" w:eastAsia="sans-serif" w:cs="Times New Roman"/>
+        </w:rPr>
+      </w:pPr>
+      <w:r>
+        <w:rPr>
+          <w:rFonts w:hint="default" w:ascii="Times New Roman" w:hAnsi="Times New Roman" w:eastAsia="sans-serif" w:cs="Times New Roman"/>
+        </w:rPr>
+        <w:t>Sincerely,</w:t>
+      </w:r>
     </w:p>
     <w:p>
       <w:pPr>
@@ -1404,7 +1395,7 @@
     <w:lsdException w:uiPriority="99" w:name="footnote text"/>
     <w:lsdException w:uiPriority="99" w:name="annotation text"/>
     <w:lsdException w:qFormat="1" w:uiPriority="99" w:semiHidden="0" w:name="header"/>
-    <w:lsdException w:uiPriority="99" w:semiHidden="0" w:name="footer"/>
+    <w:lsdException w:qFormat="1" w:uiPriority="99" w:semiHidden="0" w:name="footer"/>
     <w:lsdException w:uiPriority="99" w:name="index heading"/>
     <w:lsdException w:qFormat="1" w:uiPriority="35" w:name="caption"/>
     <w:lsdException w:uiPriority="99" w:name="table of figures"/>
@@ -1663,6 +1654,7 @@
     <w:basedOn w:val="1"/>
     <w:link w:val="11"/>
     <w:unhideWhenUsed/>
+    <w:qFormat/>
     <w:uiPriority w:val="99"/>
     <w:pPr>
       <w:tabs>

</xml_diff>